<commit_message>
feat: dynamisation complète des filières et nettoyage du code
</commit_message>
<xml_diff>
--- a/resources/templates/pv_template1.docx
+++ b/resources/templates/pv_template1.docx
@@ -259,46 +259,14 @@
           <w:sz w:val="24"/>
           <w:szCs w:val="24"/>
         </w:rPr>
-        <w:t>${</w:t>
-      </w:r>
-      <w:proofErr w:type="spellStart"/>
-      <w:r>
-        <w:rPr>
-          <w:sz w:val="24"/>
-          <w:szCs w:val="24"/>
-        </w:rPr>
-        <w:t>nom_</w:t>
-      </w:r>
-      <w:proofErr w:type="gramStart"/>
-      <w:r>
-        <w:rPr>
-          <w:sz w:val="24"/>
-          <w:szCs w:val="24"/>
-        </w:rPr>
-        <w:t>etudiant</w:t>
-      </w:r>
-      <w:proofErr w:type="spellEnd"/>
-      <w:r>
-        <w:rPr>
-          <w:sz w:val="24"/>
-          <w:szCs w:val="24"/>
-        </w:rPr>
-        <w:t>}</w:t>
-      </w:r>
-      <w:r>
-        <w:rPr>
-          <w:sz w:val="24"/>
-          <w:szCs w:val="24"/>
-        </w:rPr>
-        <w:t>…</w:t>
-      </w:r>
-      <w:proofErr w:type="gramEnd"/>
-      <w:r>
-        <w:rPr>
-          <w:sz w:val="24"/>
-          <w:szCs w:val="24"/>
-        </w:rPr>
-        <w:t>……………………………</w:t>
+        <w:t>${nom_etudiant}</w:t>
+      </w:r>
+      <w:r>
+        <w:rPr>
+          <w:sz w:val="24"/>
+          <w:szCs w:val="24"/>
+        </w:rPr>
+        <w:t>………………………………</w:t>
       </w:r>
     </w:p>
     <w:p>
@@ -356,222 +324,7 @@
           <w:sz w:val="24"/>
           <w:szCs w:val="24"/>
         </w:rPr>
-        <w:t>${</w:t>
-      </w:r>
-      <w:proofErr w:type="spellStart"/>
-      <w:r>
-        <w:rPr>
-          <w:b/>
-          <w:bCs/>
-          <w:sz w:val="24"/>
-          <w:szCs w:val="24"/>
-        </w:rPr>
-        <w:t>check_id</w:t>
-      </w:r>
-      <w:proofErr w:type="spellEnd"/>
-      <w:r>
-        <w:rPr>
-          <w:b/>
-          <w:bCs/>
-          <w:sz w:val="24"/>
-          <w:szCs w:val="24"/>
-        </w:rPr>
-        <w:t>}</w:t>
-      </w:r>
-      <w:r>
-        <w:rPr>
-          <w:b/>
-          <w:bCs/>
-          <w:sz w:val="24"/>
-          <w:szCs w:val="24"/>
-        </w:rPr>
-        <w:t xml:space="preserve"> </w:t>
-      </w:r>
-      <w:r>
-        <w:rPr>
-          <w:b/>
-          <w:bCs/>
-          <w:sz w:val="24"/>
-          <w:szCs w:val="24"/>
-        </w:rPr>
-        <w:t>Ingénierie des Données</w:t>
-      </w:r>
-      <w:r>
-        <w:rPr>
-          <w:b/>
-          <w:bCs/>
-          <w:sz w:val="24"/>
-          <w:szCs w:val="24"/>
-        </w:rPr>
-        <w:t xml:space="preserve"> </w:t>
-      </w:r>
-      <w:r>
-        <w:rPr>
-          <w:b/>
-          <w:bCs/>
-          <w:sz w:val="24"/>
-          <w:szCs w:val="24"/>
-        </w:rPr>
-        <w:t xml:space="preserve"> </w:t>
-      </w:r>
-    </w:p>
-    <w:p>
-      <w:pPr>
-        <w:pStyle w:val="BodyText3"/>
-        <w:spacing w:after="120" w:line="360" w:lineRule="auto"/>
-        <w:ind w:left="708"/>
-        <w:rPr>
-          <w:b/>
-          <w:bCs/>
-          <w:sz w:val="24"/>
-          <w:szCs w:val="24"/>
-        </w:rPr>
-      </w:pPr>
-      <w:r>
-        <w:rPr>
-          <w:b/>
-          <w:bCs/>
-          <w:sz w:val="24"/>
-          <w:szCs w:val="24"/>
-        </w:rPr>
-        <w:t xml:space="preserve">      </w:t>
-      </w:r>
-      <w:r>
-        <w:rPr>
-          <w:b/>
-          <w:bCs/>
-          <w:sz w:val="24"/>
-          <w:szCs w:val="24"/>
-        </w:rPr>
-        <w:t>${</w:t>
-      </w:r>
-      <w:proofErr w:type="spellStart"/>
-      <w:r>
-        <w:rPr>
-          <w:b/>
-          <w:bCs/>
-          <w:sz w:val="24"/>
-          <w:szCs w:val="24"/>
-        </w:rPr>
-        <w:t>check_</w:t>
-      </w:r>
-      <w:r>
-        <w:rPr>
-          <w:b/>
-          <w:bCs/>
-          <w:sz w:val="24"/>
-          <w:szCs w:val="24"/>
-        </w:rPr>
-        <w:t>tdia</w:t>
-      </w:r>
-      <w:proofErr w:type="spellEnd"/>
-      <w:r>
-        <w:rPr>
-          <w:b/>
-          <w:bCs/>
-          <w:sz w:val="24"/>
-          <w:szCs w:val="24"/>
-        </w:rPr>
-        <w:t>}</w:t>
-      </w:r>
-      <w:r>
-        <w:rPr>
-          <w:b/>
-          <w:bCs/>
-          <w:sz w:val="24"/>
-          <w:szCs w:val="24"/>
-        </w:rPr>
-        <w:t xml:space="preserve"> Transformation Digitale Et Intelligence Artificiel</w:t>
-      </w:r>
-    </w:p>
-    <w:p>
-      <w:pPr>
-        <w:pStyle w:val="BodyText3"/>
-        <w:spacing w:after="120" w:line="360" w:lineRule="auto"/>
-        <w:ind w:left="708"/>
-        <w:rPr>
-          <w:b/>
-          <w:bCs/>
-          <w:sz w:val="24"/>
-          <w:szCs w:val="24"/>
-          <w:u w:val="single"/>
-        </w:rPr>
-      </w:pPr>
-      <w:r>
-        <w:rPr>
-          <w:b/>
-          <w:bCs/>
-          <w:sz w:val="24"/>
-          <w:szCs w:val="24"/>
-        </w:rPr>
-        <w:t xml:space="preserve">      </w:t>
-      </w:r>
-      <w:r>
-        <w:rPr>
-          <w:b/>
-          <w:bCs/>
-          <w:sz w:val="24"/>
-          <w:szCs w:val="24"/>
-        </w:rPr>
-        <w:t>${</w:t>
-      </w:r>
-      <w:proofErr w:type="spellStart"/>
-      <w:r>
-        <w:rPr>
-          <w:b/>
-          <w:bCs/>
-          <w:sz w:val="24"/>
-          <w:szCs w:val="24"/>
-        </w:rPr>
-        <w:t>check_</w:t>
-      </w:r>
-      <w:r>
-        <w:rPr>
-          <w:b/>
-          <w:bCs/>
-          <w:sz w:val="24"/>
-          <w:szCs w:val="24"/>
-        </w:rPr>
-        <w:t>gi</w:t>
-      </w:r>
-      <w:proofErr w:type="spellEnd"/>
-      <w:r>
-        <w:rPr>
-          <w:b/>
-          <w:bCs/>
-          <w:sz w:val="24"/>
-          <w:szCs w:val="24"/>
-        </w:rPr>
-        <w:t>}</w:t>
-      </w:r>
-      <w:r>
-        <w:rPr>
-          <w:b/>
-          <w:bCs/>
-          <w:sz w:val="24"/>
-          <w:szCs w:val="24"/>
-        </w:rPr>
-        <w:t xml:space="preserve"> </w:t>
-      </w:r>
-      <w:proofErr w:type="spellStart"/>
-      <w:r>
-        <w:rPr>
-          <w:b/>
-          <w:bCs/>
-          <w:sz w:val="24"/>
-          <w:szCs w:val="24"/>
-        </w:rPr>
-        <w:t>Genie</w:t>
-      </w:r>
-      <w:proofErr w:type="spellEnd"/>
-      <w:r>
-        <w:rPr>
-          <w:b/>
-          <w:bCs/>
-          <w:sz w:val="24"/>
-          <w:szCs w:val="24"/>
-        </w:rPr>
-        <w:t xml:space="preserve"> Informatique</w:t>
+        <w:t>${filieres_checkboxes}</w:t>
       </w:r>
     </w:p>
     <w:p>
@@ -629,7 +382,6 @@
           <w:lang w:val="en-US"/>
         </w:rPr>
       </w:pPr>
-      <w:proofErr w:type="spellStart"/>
       <w:r>
         <w:rPr>
           <w:b/>
@@ -641,7 +393,6 @@
         </w:rPr>
         <w:t>L'encadrant</w:t>
       </w:r>
-      <w:proofErr w:type="spellEnd"/>
       <w:r>
         <w:rPr>
           <w:b/>
@@ -981,15 +732,7 @@
                 <w:sz w:val="24"/>
                 <w:szCs w:val="24"/>
               </w:rPr>
-              <w:t>jury</w:t>
-            </w:r>
-            <w:proofErr w:type="gramStart"/>
-            <w:r>
-              <w:rPr>
-                <w:sz w:val="24"/>
-                <w:szCs w:val="24"/>
-              </w:rPr>
-              <w:t>2</w:t>
+              <w:t>jury2</w:t>
             </w:r>
             <w:r>
               <w:rPr>
@@ -1003,15 +746,7 @@
                 <w:sz w:val="24"/>
                 <w:szCs w:val="24"/>
               </w:rPr>
-              <w:t>…</w:t>
-            </w:r>
-            <w:proofErr w:type="gramEnd"/>
-            <w:r>
-              <w:rPr>
-                <w:sz w:val="24"/>
-                <w:szCs w:val="24"/>
-              </w:rPr>
-              <w:t>…………………………</w:t>
+              <w:t>……………………………</w:t>
             </w:r>
             <w:r>
               <w:rPr>
@@ -1124,15 +859,7 @@
                 <w:sz w:val="24"/>
                 <w:szCs w:val="24"/>
               </w:rPr>
-              <w:t>jury</w:t>
-            </w:r>
-            <w:proofErr w:type="gramStart"/>
-            <w:r>
-              <w:rPr>
-                <w:sz w:val="24"/>
-                <w:szCs w:val="24"/>
-              </w:rPr>
-              <w:t>3</w:t>
+              <w:t>jury3</w:t>
             </w:r>
             <w:r>
               <w:rPr>
@@ -1146,15 +873,7 @@
                 <w:sz w:val="24"/>
                 <w:szCs w:val="24"/>
               </w:rPr>
-              <w:t>…</w:t>
-            </w:r>
-            <w:proofErr w:type="gramEnd"/>
-            <w:r>
-              <w:rPr>
-                <w:sz w:val="24"/>
-                <w:szCs w:val="24"/>
-              </w:rPr>
-              <w:t>…………………………</w:t>
+              <w:t>……………………………</w:t>
             </w:r>
             <w:r>
               <w:rPr>
@@ -1292,7 +1011,6 @@
           <w:szCs w:val="24"/>
         </w:rPr>
       </w:pPr>
-      <w:proofErr w:type="gramStart"/>
       <w:r>
         <w:rPr>
           <w:sz w:val="24"/>
@@ -1309,7 +1027,6 @@
         </w:rPr>
         <w:t>=</w:t>
       </w:r>
-      <w:proofErr w:type="gramEnd"/>
       <w:r>
         <w:rPr>
           <w:b/>
@@ -1890,7 +1607,6 @@
         </w:rPr>
         <w:t>${</w:t>
       </w:r>
-      <w:proofErr w:type="gramStart"/>
       <w:r>
         <w:rPr>
           <w:sz w:val="24"/>
@@ -1912,7 +1628,6 @@
         </w:rPr>
         <w:t xml:space="preserve">   </w:t>
       </w:r>
-      <w:proofErr w:type="gramEnd"/>
       <w:r>
         <w:rPr>
           <w:sz w:val="24"/>
@@ -3291,7 +3006,6 @@
   <w:style w:type="character" w:default="1" w:styleId="DefaultParagraphFont">
     <w:name w:val="Default Paragraph Font"/>
     <w:uiPriority w:val="1"/>
-    <w:semiHidden/>
     <w:unhideWhenUsed/>
   </w:style>
   <w:style w:type="table" w:default="1" w:styleId="TableNormal">

</xml_diff>